<commit_message>
Replace preparatory PDF with generated DOCX
</commit_message>
<xml_diff>
--- a/odigoi/01_lab1-docker.docx
+++ b/odigoi/01_lab1-docker.docx
@@ -20,7 +20,7 @@
           <w:sz w:val="22"/>
           <w:szCs w:val="22"/>
         </w:rPr>
-        <w:id w:val="-144426875"/>
+        <w:id w:val="90747767"/>
         <w:docPartObj>
           <w:docPartGallery w:val="Table of Contents"/>
           <w:docPartUnique/>
@@ -61,7 +61,7 @@
           <w:r>
             <w:fldChar w:fldCharType="separate"/>
           </w:r>
-          <w:hyperlink w:anchor="_Toc224650770" w:history="1">
+          <w:hyperlink w:anchor="_Toc224651089" w:history="1">
             <w:r>
               <w:rPr>
                 <w:rStyle w:val="Hyperlink"/>
@@ -88,7 +88,7 @@
                 <w:noProof/>
                 <w:webHidden/>
               </w:rPr>
-              <w:instrText xml:space="preserve"> PAGEREF _Toc224650770 \h </w:instrText>
+              <w:instrText xml:space="preserve"> PAGEREF _Toc224651089 \h </w:instrText>
             </w:r>
             <w:r>
               <w:rPr>
@@ -135,7 +135,7 @@
               <w14:ligatures w14:val="standardContextual"/>
             </w:rPr>
           </w:pPr>
-          <w:hyperlink w:anchor="_Toc224650771" w:history="1">
+          <w:hyperlink w:anchor="_Toc224651090" w:history="1">
             <w:r>
               <w:rPr>
                 <w:rStyle w:val="Hyperlink"/>
@@ -162,7 +162,7 @@
                 <w:noProof/>
                 <w:webHidden/>
               </w:rPr>
-              <w:instrText xml:space="preserve"> PAGEREF _Toc224650771 \h </w:instrText>
+              <w:instrText xml:space="preserve"> PAGEREF _Toc224651090 \h </w:instrText>
             </w:r>
             <w:r>
               <w:rPr>
@@ -209,7 +209,7 @@
               <w14:ligatures w14:val="standardContextual"/>
             </w:rPr>
           </w:pPr>
-          <w:hyperlink w:anchor="_Toc224650772" w:history="1">
+          <w:hyperlink w:anchor="_Toc224651091" w:history="1">
             <w:r>
               <w:rPr>
                 <w:rStyle w:val="Hyperlink"/>
@@ -236,7 +236,7 @@
                 <w:noProof/>
                 <w:webHidden/>
               </w:rPr>
-              <w:instrText xml:space="preserve"> PAGEREF _Toc224650772 \h </w:instrText>
+              <w:instrText xml:space="preserve"> PAGEREF _Toc224651091 \h </w:instrText>
             </w:r>
             <w:r>
               <w:rPr>
@@ -283,7 +283,7 @@
               <w14:ligatures w14:val="standardContextual"/>
             </w:rPr>
           </w:pPr>
-          <w:hyperlink w:anchor="_Toc224650773" w:history="1">
+          <w:hyperlink w:anchor="_Toc224651092" w:history="1">
             <w:r>
               <w:rPr>
                 <w:rStyle w:val="Hyperlink"/>
@@ -310,7 +310,7 @@
                 <w:noProof/>
                 <w:webHidden/>
               </w:rPr>
-              <w:instrText xml:space="preserve"> PAGEREF _Toc224650773 \h </w:instrText>
+              <w:instrText xml:space="preserve"> PAGEREF _Toc224651092 \h </w:instrText>
             </w:r>
             <w:r>
               <w:rPr>
@@ -353,7 +353,7 @@
         <w:pStyle w:val="Heading1"/>
       </w:pPr>
       <w:bookmarkStart w:id="0" w:name="αρχιτεκτονική-hdfs-και-spark"/>
-      <w:bookmarkStart w:id="1" w:name="_Toc224650770"/>
+      <w:bookmarkStart w:id="1" w:name="_Toc224651089"/>
       <w:r>
         <w:t>Αρχιτεκτονική HDFS και Spark</w:t>
       </w:r>
@@ -383,7 +383,7 @@
           <w:noProof/>
         </w:rPr>
         <w:drawing>
-          <wp:inline distT="0" distB="0" distL="0" distR="0" wp14:anchorId="49FB64BE" wp14:editId="4C549CD2">
+          <wp:inline distT="0" distB="0" distL="0" distR="0" wp14:anchorId="54D3985D" wp14:editId="548917BA">
             <wp:extent cx="6692900" cy="4625299"/>
             <wp:effectExtent l="0" t="0" r="0" b="0"/>
             <wp:docPr id="22" name="Picture" descr="Εικόνα 1"/>
@@ -483,7 +483,7 @@
           <w:noProof/>
         </w:rPr>
         <w:drawing>
-          <wp:inline distT="0" distB="0" distL="0" distR="0" wp14:anchorId="65110F49" wp14:editId="5A844C0B">
+          <wp:inline distT="0" distB="0" distL="0" distR="0" wp14:anchorId="2A6022A6" wp14:editId="451DF93F">
             <wp:extent cx="6680200" cy="4470400"/>
             <wp:effectExtent l="0" t="0" r="0" b="0"/>
             <wp:docPr id="25" name="Picture" descr="Εικόνα 2"/>
@@ -535,7 +535,7 @@
         </w:rPr>
         <w:lastRenderedPageBreak/>
         <w:drawing>
-          <wp:inline distT="0" distB="0" distL="0" distR="0" wp14:anchorId="20662AC0" wp14:editId="0A82B8AF">
+          <wp:inline distT="0" distB="0" distL="0" distR="0" wp14:anchorId="29EFAF8B" wp14:editId="6B2E302D">
             <wp:extent cx="6692900" cy="3111152"/>
             <wp:effectExtent l="0" t="0" r="0" b="0"/>
             <wp:docPr id="28" name="Picture" descr="Εικόνα 3"/>
@@ -636,7 +636,7 @@
         <w:pStyle w:val="Heading1"/>
       </w:pPr>
       <w:bookmarkStart w:id="2" w:name="βασικές-έννοιες-docker"/>
-      <w:bookmarkStart w:id="3" w:name="_Toc224650771"/>
+      <w:bookmarkStart w:id="3" w:name="_Toc224651090"/>
       <w:bookmarkEnd w:id="0"/>
       <w:r>
         <w:t>Βασικές έννοιες Docker</w:t>
@@ -1040,7 +1040,7 @@
           <w:noProof/>
         </w:rPr>
         <w:drawing>
-          <wp:inline distT="0" distB="0" distL="0" distR="0" wp14:anchorId="53F3B623" wp14:editId="479F4F21">
+          <wp:inline distT="0" distB="0" distL="0" distR="0" wp14:anchorId="65FB0F87" wp14:editId="6B8F9E82">
             <wp:extent cx="6692900" cy="2040481"/>
             <wp:effectExtent l="0" t="0" r="0" b="0"/>
             <wp:docPr id="32" name="Picture" descr="Εικόνα 4"/>
@@ -1113,7 +1113,7 @@
           <w:noProof/>
         </w:rPr>
         <w:drawing>
-          <wp:inline distT="0" distB="0" distL="0" distR="0" wp14:anchorId="45AB8CD7" wp14:editId="6146E480">
+          <wp:inline distT="0" distB="0" distL="0" distR="0" wp14:anchorId="7FC0D3B7" wp14:editId="2387024D">
             <wp:extent cx="5707781" cy="346509"/>
             <wp:effectExtent l="0" t="0" r="0" b="0"/>
             <wp:docPr id="35" name="Picture" descr="Εικόνα 5"/>
@@ -1225,7 +1225,7 @@
         <w:pStyle w:val="Heading1"/>
       </w:pPr>
       <w:bookmarkStart w:id="4" w:name="X50eac03fae559d12670611e8dc0b00329030a4f"/>
-      <w:bookmarkStart w:id="5" w:name="_Toc224650772"/>
+      <w:bookmarkStart w:id="5" w:name="_Toc224651091"/>
       <w:bookmarkEnd w:id="2"/>
       <w:r>
         <w:t>Οδηγός εγκατάστασης Apache Spark και HDFS στον τοπικό υπολογιστή με χρήση docker containers.</w:t>
@@ -1432,7 +1432,7 @@
           <w:noProof/>
         </w:rPr>
         <w:drawing>
-          <wp:inline distT="0" distB="0" distL="0" distR="0" wp14:anchorId="77B8FEE1" wp14:editId="0F16EBA9">
+          <wp:inline distT="0" distB="0" distL="0" distR="0" wp14:anchorId="0D701054" wp14:editId="1F2F1D84">
             <wp:extent cx="6692900" cy="3291679"/>
             <wp:effectExtent l="0" t="0" r="0" b="0"/>
             <wp:docPr id="39" name="Picture" descr="Εικόνα 6"/>
@@ -1505,7 +1505,7 @@
           <w:noProof/>
         </w:rPr>
         <w:drawing>
-          <wp:inline distT="0" distB="0" distL="0" distR="0" wp14:anchorId="7D5B77DA" wp14:editId="3911CEA5">
+          <wp:inline distT="0" distB="0" distL="0" distR="0" wp14:anchorId="6D8C10DD" wp14:editId="316FEC2A">
             <wp:extent cx="6692900" cy="788569"/>
             <wp:effectExtent l="0" t="0" r="0" b="0"/>
             <wp:docPr id="42" name="Picture" descr="Εικόνα 7"/>
@@ -1566,7 +1566,7 @@
         </w:rPr>
         <w:lastRenderedPageBreak/>
         <w:drawing>
-          <wp:inline distT="0" distB="0" distL="0" distR="0" wp14:anchorId="7B3171DF" wp14:editId="32EA615D">
+          <wp:inline distT="0" distB="0" distL="0" distR="0" wp14:anchorId="2DC3E718" wp14:editId="4F854368">
             <wp:extent cx="6438900" cy="10591800"/>
             <wp:effectExtent l="0" t="0" r="0" b="0"/>
             <wp:docPr id="45" name="Picture" descr="Εικόνα 8"/>
@@ -1672,7 +1672,7 @@
           <w:noProof/>
         </w:rPr>
         <w:drawing>
-          <wp:inline distT="0" distB="0" distL="0" distR="0" wp14:anchorId="64A5EF3F" wp14:editId="4CD82225">
+          <wp:inline distT="0" distB="0" distL="0" distR="0" wp14:anchorId="4677D5C1" wp14:editId="7E50394E">
             <wp:extent cx="6692900" cy="7709300"/>
             <wp:effectExtent l="0" t="0" r="0" b="0"/>
             <wp:docPr id="48" name="Picture" descr="Εικόνα 9"/>
@@ -1741,7 +1741,7 @@
           <w:noProof/>
         </w:rPr>
         <w:drawing>
-          <wp:inline distT="0" distB="0" distL="0" distR="0" wp14:anchorId="1AA2D29D" wp14:editId="73769D76">
+          <wp:inline distT="0" distB="0" distL="0" distR="0" wp14:anchorId="66B370A0" wp14:editId="0CF49DBE">
             <wp:extent cx="6692900" cy="5648755"/>
             <wp:effectExtent l="0" t="0" r="0" b="0"/>
             <wp:docPr id="51" name="Picture" descr="Εικόνα 10"/>
@@ -1829,7 +1829,7 @@
         </w:rPr>
         <w:lastRenderedPageBreak/>
         <w:drawing>
-          <wp:inline distT="0" distB="0" distL="0" distR="0" wp14:anchorId="28839C33" wp14:editId="5C0C0C65">
+          <wp:inline distT="0" distB="0" distL="0" distR="0" wp14:anchorId="1F543FEB" wp14:editId="7E24CF31">
             <wp:extent cx="6692900" cy="3630867"/>
             <wp:effectExtent l="0" t="0" r="0" b="0"/>
             <wp:docPr id="54" name="Picture" descr="Εικόνα 11"/>
@@ -1902,7 +1902,7 @@
           <w:noProof/>
         </w:rPr>
         <w:drawing>
-          <wp:inline distT="0" distB="0" distL="0" distR="0" wp14:anchorId="55445D8D" wp14:editId="3AC5C26A">
+          <wp:inline distT="0" distB="0" distL="0" distR="0" wp14:anchorId="652D8D2D" wp14:editId="1F8DD349">
             <wp:extent cx="6429675" cy="1761423"/>
             <wp:effectExtent l="0" t="0" r="0" b="0"/>
             <wp:docPr id="57" name="Picture" descr="Εικόνα 12"/>
@@ -1978,7 +1978,7 @@
         </w:rPr>
         <w:lastRenderedPageBreak/>
         <w:drawing>
-          <wp:inline distT="0" distB="0" distL="0" distR="0" wp14:anchorId="4FC02E54" wp14:editId="1ABE33D8">
+          <wp:inline distT="0" distB="0" distL="0" distR="0" wp14:anchorId="1EEF6C7E" wp14:editId="6221D080">
             <wp:extent cx="2483317" cy="6477802"/>
             <wp:effectExtent l="0" t="0" r="0" b="0"/>
             <wp:docPr id="60" name="Picture" descr="Εικόνα 13"/>
@@ -2069,7 +2069,7 @@
           <w:noProof/>
         </w:rPr>
         <w:drawing>
-          <wp:inline distT="0" distB="0" distL="0" distR="0" wp14:anchorId="0DD7AB75" wp14:editId="25D94DA5">
+          <wp:inline distT="0" distB="0" distL="0" distR="0" wp14:anchorId="46489737" wp14:editId="69DDF537">
             <wp:extent cx="6692900" cy="1923612"/>
             <wp:effectExtent l="0" t="0" r="0" b="0"/>
             <wp:docPr id="63" name="Picture" descr="Εικόνα 14"/>
@@ -2161,7 +2161,7 @@
           <w:noProof/>
         </w:rPr>
         <w:drawing>
-          <wp:inline distT="0" distB="0" distL="0" distR="0" wp14:anchorId="1C8477E1" wp14:editId="20F7AA6A">
+          <wp:inline distT="0" distB="0" distL="0" distR="0" wp14:anchorId="03152FD4" wp14:editId="5ED87A42">
             <wp:extent cx="6692900" cy="2360127"/>
             <wp:effectExtent l="0" t="0" r="0" b="0"/>
             <wp:docPr id="66" name="Picture" descr="Εικόνα 15"/>
@@ -2452,7 +2452,7 @@
         </w:rPr>
         <w:lastRenderedPageBreak/>
         <w:drawing>
-          <wp:inline distT="0" distB="0" distL="0" distR="0" wp14:anchorId="58515669" wp14:editId="436CD2EF">
+          <wp:inline distT="0" distB="0" distL="0" distR="0" wp14:anchorId="31D71032" wp14:editId="22950CF5">
             <wp:extent cx="6692900" cy="3823835"/>
             <wp:effectExtent l="0" t="0" r="0" b="0"/>
             <wp:docPr id="69" name="Picture" descr="Εικόνα 16"/>
@@ -2499,7 +2499,7 @@
         <w:pStyle w:val="Heading1"/>
       </w:pPr>
       <w:bookmarkStart w:id="6" w:name="εκτέλεση-προγραμμάτων-στη-συστοιχία"/>
-      <w:bookmarkStart w:id="7" w:name="_Toc224650773"/>
+      <w:bookmarkStart w:id="7" w:name="_Toc224651092"/>
       <w:bookmarkEnd w:id="4"/>
       <w:r>
         <w:t>Εκτέλεση προγραμμάτων στη συστοιχία</w:t>
@@ -2701,7 +2701,7 @@
         </w:rPr>
         <w:lastRenderedPageBreak/>
         <w:drawing>
-          <wp:inline distT="0" distB="0" distL="0" distR="0" wp14:anchorId="40E4FE08" wp14:editId="2BF23F44">
+          <wp:inline distT="0" distB="0" distL="0" distR="0" wp14:anchorId="4B1ECEB9" wp14:editId="77ED6020">
             <wp:extent cx="6692900" cy="1101215"/>
             <wp:effectExtent l="0" t="0" r="0" b="0"/>
             <wp:docPr id="73" name="Picture" descr="Εικόνα 17"/>
@@ -2784,7 +2784,7 @@
           <w:noProof/>
         </w:rPr>
         <w:drawing>
-          <wp:inline distT="0" distB="0" distL="0" distR="0" wp14:anchorId="0771DCB0" wp14:editId="362BFC44">
+          <wp:inline distT="0" distB="0" distL="0" distR="0" wp14:anchorId="688DB26B" wp14:editId="1F02AA62">
             <wp:extent cx="6692900" cy="1722842"/>
             <wp:effectExtent l="0" t="0" r="0" b="0"/>
             <wp:docPr id="76" name="Picture" descr="Εικόνα 18"/>
@@ -2866,7 +2866,7 @@
           <w:noProof/>
         </w:rPr>
         <w:drawing>
-          <wp:inline distT="0" distB="0" distL="0" distR="0" wp14:anchorId="50799C9C" wp14:editId="6479F9B1">
+          <wp:inline distT="0" distB="0" distL="0" distR="0" wp14:anchorId="444F4093" wp14:editId="2F6D327A">
             <wp:extent cx="6692900" cy="397769"/>
             <wp:effectExtent l="0" t="0" r="0" b="0"/>
             <wp:docPr id="79" name="Picture" descr="Εικόνα 24"/>
@@ -3655,7 +3655,7 @@
           <w:noProof/>
         </w:rPr>
         <w:drawing>
-          <wp:inline distT="0" distB="0" distL="0" distR="0" wp14:anchorId="366CE028" wp14:editId="09E024BE">
+          <wp:inline distT="0" distB="0" distL="0" distR="0" wp14:anchorId="0B363B74" wp14:editId="3A938F68">
             <wp:extent cx="6692900" cy="1694227"/>
             <wp:effectExtent l="0" t="0" r="0" b="0"/>
             <wp:docPr id="82" name="Picture" descr="Εικόνα 19"/>
@@ -3758,7 +3758,7 @@
           <w:noProof/>
         </w:rPr>
         <w:drawing>
-          <wp:inline distT="0" distB="0" distL="0" distR="0" wp14:anchorId="76EE4810" wp14:editId="2E4F931D">
+          <wp:inline distT="0" distB="0" distL="0" distR="0" wp14:anchorId="49F16072" wp14:editId="4C0DE32F">
             <wp:extent cx="6692900" cy="761605"/>
             <wp:effectExtent l="0" t="0" r="0" b="0"/>
             <wp:docPr id="85" name="Picture" descr="Εικόνα 20"/>
@@ -3922,7 +3922,7 @@
         </w:rPr>
         <w:lastRenderedPageBreak/>
         <w:drawing>
-          <wp:inline distT="0" distB="0" distL="0" distR="0" wp14:anchorId="3DCB7868" wp14:editId="41D70273">
+          <wp:inline distT="0" distB="0" distL="0" distR="0" wp14:anchorId="4BD15FE2" wp14:editId="3A584AD3">
             <wp:extent cx="6692900" cy="6026364"/>
             <wp:effectExtent l="0" t="0" r="0" b="0"/>
             <wp:docPr id="88" name="Picture" descr="Εικόνα 21"/>
@@ -3989,7 +3989,7 @@
         </w:rPr>
         <w:lastRenderedPageBreak/>
         <w:drawing>
-          <wp:inline distT="0" distB="0" distL="0" distR="0" wp14:anchorId="7085D95B" wp14:editId="59F06142">
+          <wp:inline distT="0" distB="0" distL="0" distR="0" wp14:anchorId="683B65CE" wp14:editId="49BD71EB">
             <wp:extent cx="6692900" cy="3307628"/>
             <wp:effectExtent l="0" t="0" r="0" b="0"/>
             <wp:docPr id="91" name="Picture" descr="Εικόνα 22"/>
@@ -4040,7 +4040,7 @@
           <w:noProof/>
         </w:rPr>
         <w:drawing>
-          <wp:inline distT="0" distB="0" distL="0" distR="0" wp14:anchorId="75CFFBB6" wp14:editId="46F8740C">
+          <wp:inline distT="0" distB="0" distL="0" distR="0" wp14:anchorId="03C8154C" wp14:editId="2DE5BEAE">
             <wp:extent cx="6692900" cy="4050863"/>
             <wp:effectExtent l="0" t="0" r="0" b="0"/>
             <wp:docPr id="94" name="Picture" descr="Εικόνα 23"/>
@@ -4835,7 +4835,7 @@
   <w:abstractNum w:abstractNumId="9" w15:restartNumberingAfterBreak="0">
     <w:nsid w:val="0000A990"/>
     <w:multiLevelType w:val="multilevel"/>
-    <w:tmpl w:val="A1ACC838"/>
+    <w:tmpl w:val="4D90DFB4"/>
     <w:lvl w:ilvl="0">
       <w:numFmt w:val="bullet"/>
       <w:lvlText w:val=" "/>
@@ -4912,7 +4912,7 @@
   <w:abstractNum w:abstractNumId="10" w15:restartNumberingAfterBreak="0">
     <w:nsid w:val="0000A991"/>
     <w:multiLevelType w:val="multilevel"/>
-    <w:tmpl w:val="09EAA2DE"/>
+    <w:tmpl w:val="20FA683E"/>
     <w:lvl w:ilvl="0">
       <w:numFmt w:val="bullet"/>
       <w:lvlText w:val=""/>
@@ -5013,58 +5013,58 @@
       </w:rPr>
     </w:lvl>
   </w:abstractNum>
-  <w:num w:numId="1" w16cid:durableId="525868445">
+  <w:num w:numId="1" w16cid:durableId="414471949">
     <w:abstractNumId w:val="8"/>
   </w:num>
-  <w:num w:numId="2" w16cid:durableId="1133717780">
+  <w:num w:numId="2" w16cid:durableId="995379139">
     <w:abstractNumId w:val="6"/>
   </w:num>
-  <w:num w:numId="3" w16cid:durableId="1577284657">
+  <w:num w:numId="3" w16cid:durableId="1435203177">
     <w:abstractNumId w:val="5"/>
   </w:num>
-  <w:num w:numId="4" w16cid:durableId="810908390">
+  <w:num w:numId="4" w16cid:durableId="1486900176">
     <w:abstractNumId w:val="4"/>
   </w:num>
-  <w:num w:numId="5" w16cid:durableId="1951859778">
+  <w:num w:numId="5" w16cid:durableId="299656626">
     <w:abstractNumId w:val="7"/>
   </w:num>
-  <w:num w:numId="6" w16cid:durableId="1115516893">
+  <w:num w:numId="6" w16cid:durableId="783622868">
     <w:abstractNumId w:val="3"/>
   </w:num>
-  <w:num w:numId="7" w16cid:durableId="1694648590">
+  <w:num w:numId="7" w16cid:durableId="451025014">
     <w:abstractNumId w:val="2"/>
   </w:num>
-  <w:num w:numId="8" w16cid:durableId="1447431644">
+  <w:num w:numId="8" w16cid:durableId="525144711">
     <w:abstractNumId w:val="1"/>
   </w:num>
-  <w:num w:numId="9" w16cid:durableId="487399292">
+  <w:num w:numId="9" w16cid:durableId="2054645545">
     <w:abstractNumId w:val="0"/>
   </w:num>
-  <w:num w:numId="10" w16cid:durableId="388572414">
+  <w:num w:numId="10" w16cid:durableId="481235231">
     <w:abstractNumId w:val="9"/>
   </w:num>
-  <w:num w:numId="11" w16cid:durableId="330719770">
+  <w:num w:numId="11" w16cid:durableId="1303849720">
     <w:abstractNumId w:val="10"/>
   </w:num>
-  <w:num w:numId="12" w16cid:durableId="994575576">
+  <w:num w:numId="12" w16cid:durableId="1880824803">
     <w:abstractNumId w:val="10"/>
   </w:num>
-  <w:num w:numId="13" w16cid:durableId="319190207">
+  <w:num w:numId="13" w16cid:durableId="1853031989">
     <w:abstractNumId w:val="10"/>
   </w:num>
-  <w:num w:numId="14" w16cid:durableId="1080370957">
+  <w:num w:numId="14" w16cid:durableId="1238830603">
     <w:abstractNumId w:val="10"/>
   </w:num>
-  <w:num w:numId="15" w16cid:durableId="1862165626">
+  <w:num w:numId="15" w16cid:durableId="2091729859">
     <w:abstractNumId w:val="10"/>
   </w:num>
-  <w:num w:numId="16" w16cid:durableId="1010839802">
+  <w:num w:numId="16" w16cid:durableId="1167356832">
     <w:abstractNumId w:val="10"/>
   </w:num>
-  <w:num w:numId="17" w16cid:durableId="1993218568">
+  <w:num w:numId="17" w16cid:durableId="823007936">
     <w:abstractNumId w:val="10"/>
   </w:num>
-  <w:num w:numId="18" w16cid:durableId="815687108">
+  <w:num w:numId="18" w16cid:durableId="1408843061">
     <w:abstractNumId w:val="10"/>
   </w:num>
 </w:numbering>
@@ -16885,7 +16885,7 @@
     <w:autoRedefine/>
     <w:uiPriority w:val="39"/>
     <w:unhideWhenUsed/>
-    <w:rsid w:val="00E532FE"/>
+    <w:rsid w:val="0059270A"/>
     <w:pPr>
       <w:spacing w:after="100"/>
     </w:pPr>
@@ -16895,7 +16895,7 @@
     <w:basedOn w:val="DefaultParagraphFont"/>
     <w:uiPriority w:val="99"/>
     <w:unhideWhenUsed/>
-    <w:rsid w:val="00E532FE"/>
+    <w:rsid w:val="0059270A"/>
     <w:rPr>
       <w:color w:val="0000FF" w:themeColor="hyperlink"/>
       <w:u w:val="single"/>

</xml_diff>